<commit_message>
Add single-item print wizard, batch selection, and stable DOCX printing.
Introduces item-print flow with admin-configurable templates, row selection for summons/sessions, settings backup via QR, and print layout fixes for older Chrome.

Co-authored-by: Cursor <cursoragent@cursor.com>
</commit_message>
<xml_diff>
--- a/templates/template1.docx
+++ b/templates/template1.docx
@@ -1,6 +1,6 @@
 
 <file path=word/document.xml><?xml version="1.0" encoding="utf-8"?>
-<w:document xmlns:wpc="http://schemas.microsoft.com/office/word/2010/wordprocessingCanvas" xmlns:cx="http://schemas.microsoft.com/office/drawing/2014/chartex" xmlns:cx1="http://schemas.microsoft.com/office/drawing/2015/9/8/chartex" xmlns:cx2="http://schemas.microsoft.com/office/drawing/2015/10/21/chartex" xmlns:cx3="http://schemas.microsoft.com/office/drawing/2016/5/9/chartex" xmlns:cx4="http://schemas.microsoft.com/office/drawing/2016/5/10/chartex" xmlns:cx5="http://schemas.microsoft.com/office/drawing/2016/5/11/chartex" xmlns:cx6="http://schemas.microsoft.com/office/drawing/2016/5/12/chartex" xmlns:cx7="http://schemas.microsoft.com/office/drawing/2016/5/13/chartex" xmlns:cx8="http://schemas.microsoft.com/office/drawing/2016/5/14/chartex" xmlns:mc="http://schemas.openxmlformats.org/markup-compatibility/2006" xmlns:aink="http://schemas.microsoft.com/office/drawing/2016/ink" xmlns:am3d="http://schemas.microsoft.com/office/drawing/2017/model3d" xmlns:o="urn:schemas-microsoft-com:office:office" xmlns:oel="http://schemas.microsoft.com/office/2019/extlst" xmlns:r="http://schemas.openxmlformats.org/officeDocument/2006/relationships" xmlns:m="http://schemas.openxmlformats.org/officeDocument/2006/math" xmlns:v="urn:schemas-microsoft-com:vml" xmlns:wp14="http://schemas.microsoft.com/office/word/2010/wordprocessingDrawing" xmlns:wp="http://schemas.openxmlformats.org/drawingml/2006/wordprocessingDrawing" xmlns:w10="urn:schemas-microsoft-com:office:word" xmlns:w="http://schemas.openxmlformats.org/wordprocessingml/2006/main" xmlns:w14="http://schemas.microsoft.com/office/word/2010/wordml" xmlns:w15="http://schemas.microsoft.com/office/word/2012/wordml" xmlns:w16cex="http://schemas.microsoft.com/office/word/2018/wordml/cex" xmlns:w16cid="http://schemas.microsoft.com/office/word/2016/wordml/cid" xmlns:w16="http://schemas.microsoft.com/office/word/2018/wordml" xmlns:w16du="http://schemas.microsoft.com/office/word/2023/wordml/word16du" xmlns:w16sdtdh="http://schemas.microsoft.com/office/word/2020/wordml/sdtdatahash" xmlns:w16sdtfl="http://schemas.microsoft.com/office/word/2024/wordml/sdtformatlock" xmlns:w16se="http://schemas.microsoft.com/office/word/2015/wordml/symex" xmlns:wpg="http://schemas.microsoft.com/office/word/2010/wordprocessingGroup" xmlns:wpi="http://schemas.microsoft.com/office/word/2010/wordprocessingInk" xmlns:wne="http://schemas.microsoft.com/office/word/2006/wordml" xmlns:wps="http://schemas.microsoft.com/office/word/2010/wordprocessingShape" mc:Ignorable="w14 w15 w16se w16cid w16 w16cex w16sdtdh w16sdtfl w16du wp14">
+<w:document xmlns:wpc="http://schemas.microsoft.com/office/word/2010/wordprocessingCanvas" xmlns:cx="http://schemas.microsoft.com/office/drawing/2014/chartex" xmlns:cx1="http://schemas.microsoft.com/office/drawing/2015/9/8/chartex" xmlns:cx2="http://schemas.microsoft.com/office/drawing/2015/10/21/chartex" xmlns:cx3="http://schemas.microsoft.com/office/drawing/2016/5/9/chartex" xmlns:cx4="http://schemas.microsoft.com/office/drawing/2016/5/10/chartex" xmlns:cx5="http://schemas.microsoft.com/office/drawing/2016/5/11/chartex" xmlns:cx6="http://schemas.microsoft.com/office/drawing/2016/5/12/chartex" xmlns:cx7="http://schemas.microsoft.com/office/drawing/2016/5/13/chartex" xmlns:cx8="http://schemas.microsoft.com/office/drawing/2016/5/14/chartex" xmlns:mc="http://schemas.openxmlformats.org/markup-compatibility/2006" xmlns:m="http://schemas.openxmlformats.org/officeDocument/2006/math" xmlns:aink="http://schemas.microsoft.com/office/drawing/2016/ink" xmlns:am3d="http://schemas.microsoft.com/office/drawing/2017/model3d" xmlns:oel="http://schemas.microsoft.com/office/2019/extlst" xmlns:r="http://schemas.openxmlformats.org/officeDocument/2006/relationships" xmlns:wp14="http://schemas.microsoft.com/office/word/2010/wordprocessingDrawing" xmlns:wp="http://schemas.openxmlformats.org/drawingml/2006/wordprocessingDrawing" xmlns:wpg="http://schemas.microsoft.com/office/word/2010/wordprocessingGroup" xmlns:wpi="http://schemas.microsoft.com/office/word/2010/wordprocessingInk" xmlns:wps="http://schemas.microsoft.com/office/word/2010/wordprocessingShape" xmlns:o="urn:schemas-microsoft-com:office:office" xmlns:v="urn:schemas-microsoft-com:vml" xmlns:w10="urn:schemas-microsoft-com:office:word" xmlns:w="http://schemas.openxmlformats.org/wordprocessingml/2006/main" xmlns:w14="http://schemas.microsoft.com/office/word/2010/wordml" xmlns:w15="http://schemas.microsoft.com/office/word/2012/wordml" xmlns:w16cex="http://schemas.microsoft.com/office/word/2018/wordml/cex" xmlns:w16cid="http://schemas.microsoft.com/office/word/2016/wordml/cid" xmlns:w16="http://schemas.microsoft.com/office/word/2018/wordml" xmlns:w16sdtdh="http://schemas.microsoft.com/office/word/2020/wordml/sdtdatahash" xmlns:w16sdtfl="http://schemas.microsoft.com/office/word/2024/wordml/sdtformatlock" xmlns:w16se="http://schemas.microsoft.com/office/word/2015/wordml/symex" xmlns:w16du="http://schemas.microsoft.com/office/word/2023/wordml/word16du" xmlns:wne="http://schemas.microsoft.com/office/word/2006/wordml" mc:Ignorable="w14 w15 w16se w16cid w16 w16cex w16sdtdh w16sdtfl w16du wp14">
   <w:body>
     <w:p>
       <w:pPr>
@@ -73,48 +73,12 @@
       </w:r>
       <w:r>
         <w:rPr>
-          <w:sz w:val="32"/>
-          <w:szCs w:val="32"/>
-          <w:rtl/>
-        </w:rPr>
-        <w:br/>
-      </w:r>
-      <w:r>
-        <w:rPr>
-          <w:sz w:val="32"/>
-          <w:szCs w:val="32"/>
-          <w:rtl/>
-        </w:rPr>
-        <w:br/>
-      </w:r>
-      <w:r>
-        <w:rPr>
           <w:rFonts w:hint="cs"/>
           <w:sz w:val="32"/>
           <w:szCs w:val="32"/>
           <w:rtl/>
         </w:rPr>
-        <w:t xml:space="preserve">אריאל </w:t>
-      </w:r>
-      <w:proofErr w:type="spellStart"/>
-      <w:r>
-        <w:rPr>
-          <w:rFonts w:hint="cs"/>
-          <w:sz w:val="32"/>
-          <w:szCs w:val="32"/>
-          <w:rtl/>
-        </w:rPr>
-        <w:t>פלישבסקי</w:t>
-      </w:r>
-      <w:proofErr w:type="spellEnd"/>
-      <w:r>
-        <w:rPr>
-          <w:rFonts w:hint="cs"/>
-          <w:sz w:val="32"/>
-          <w:szCs w:val="32"/>
-          <w:rtl/>
-        </w:rPr>
-        <w:t>: [שם האירוע]</w:t>
+        <w:t>[יום עברי] [חודש עברי] [שנה עברית]</w:t>
       </w:r>
     </w:p>
     <w:p>
@@ -133,6 +97,70 @@
           <w:szCs w:val="32"/>
           <w:rtl/>
         </w:rPr>
+        <w:t>[יום לועזי] [חודש לועזי] [שנה לועזי]</w:t>
+      </w:r>
+      <w:r>
+        <w:rPr>
+          <w:sz w:val="32"/>
+          <w:szCs w:val="32"/>
+          <w:rtl/>
+        </w:rPr>
+        <w:br/>
+      </w:r>
+      <w:r>
+        <w:rPr>
+          <w:sz w:val="32"/>
+          <w:szCs w:val="32"/>
+          <w:rtl/>
+        </w:rPr>
+        <w:br/>
+      </w:r>
+      <w:r>
+        <w:rPr>
+          <w:rFonts w:hint="cs"/>
+          <w:sz w:val="32"/>
+          <w:szCs w:val="32"/>
+          <w:rtl/>
+        </w:rPr>
+        <w:t xml:space="preserve">אריאל </w:t>
+      </w:r>
+      <w:proofErr w:type="spellStart"/>
+      <w:r>
+        <w:rPr>
+          <w:rFonts w:hint="cs"/>
+          <w:sz w:val="32"/>
+          <w:szCs w:val="32"/>
+          <w:rtl/>
+        </w:rPr>
+        <w:t>פלישבסקי</w:t>
+      </w:r>
+      <w:proofErr w:type="spellEnd"/>
+      <w:r>
+        <w:rPr>
+          <w:rFonts w:hint="cs"/>
+          <w:sz w:val="32"/>
+          <w:szCs w:val="32"/>
+          <w:rtl/>
+        </w:rPr>
+        <w:t>: [שם האירוע]</w:t>
+      </w:r>
+    </w:p>
+    <w:p>
+      <w:pPr>
+        <w:bidi/>
+        <w:rPr>
+          <w:sz w:val="32"/>
+          <w:szCs w:val="32"/>
+          <w:rtl/>
+        </w:rPr>
+      </w:pPr>
+      <w:r>
+        <w:rPr>
+          <w:rFonts w:hint="cs"/>
+          <w:sz w:val="32"/>
+          <w:szCs w:val="32"/>
+          <w:rtl/>
+        </w:rPr>
         <w:t>[חיים]</w:t>
       </w:r>
       <w:r>
@@ -296,6 +324,50 @@
           <w:rtl/>
         </w:rPr>
         <w:t>[שם פרטי]</w:t>
+      </w:r>
+    </w:p>
+    <w:p>
+      <w:pPr>
+        <w:bidi/>
+        <w:rPr>
+          <w:sz w:val="32"/>
+          <w:szCs w:val="32"/>
+          <w:rtl/>
+        </w:rPr>
+      </w:pPr>
+      <w:r>
+        <w:rPr>
+          <w:rFonts w:hint="cs"/>
+          <w:sz w:val="32"/>
+          <w:szCs w:val="32"/>
+          <w:rtl/>
+        </w:rPr>
+        <w:t>שם משפחה:</w:t>
+      </w:r>
+      <w:r>
+        <w:rPr>
+          <w:rFonts w:hint="cs"/>
+          <w:sz w:val="32"/>
+          <w:szCs w:val="32"/>
+          <w:rtl/>
+        </w:rPr>
+        <w:t xml:space="preserve">    </w:t>
+      </w:r>
+      <w:r>
+        <w:rPr>
+          <w:sz w:val="32"/>
+          <w:szCs w:val="32"/>
+        </w:rPr>
+        <w:t xml:space="preserve"> </w:t>
+      </w:r>
+      <w:r>
+        <w:rPr>
+          <w:rFonts w:hint="cs"/>
+          <w:sz w:val="32"/>
+          <w:szCs w:val="32"/>
+          <w:rtl/>
+        </w:rPr>
+        <w:t>[שם משפחה]</w:t>
       </w:r>
     </w:p>
     <w:p>
@@ -309,32 +381,7 @@
           <w:szCs w:val="32"/>
           <w:rtl/>
         </w:rPr>
-        <w:t>שם משפחה:</w:t>
-      </w:r>
-      <w:r>
-        <w:rPr>
-          <w:rFonts w:hint="cs"/>
-          <w:sz w:val="32"/>
-          <w:szCs w:val="32"/>
-          <w:rtl/>
-        </w:rPr>
-        <w:t xml:space="preserve">    </w:t>
-      </w:r>
-      <w:r>
-        <w:rPr>
-          <w:sz w:val="32"/>
-          <w:szCs w:val="32"/>
-        </w:rPr>
-        <w:t xml:space="preserve"> </w:t>
-      </w:r>
-      <w:r>
-        <w:rPr>
-          <w:rFonts w:hint="cs"/>
-          <w:sz w:val="32"/>
-          <w:szCs w:val="32"/>
-          <w:rtl/>
-        </w:rPr>
-        <w:t>[שם משפחה]</w:t>
+        <w:t>[בדיקה]</w:t>
       </w:r>
       <w:r>
         <w:rPr>
@@ -359,7 +406,7 @@
 </file>
 
 <file path=word/endnotes.xml><?xml version="1.0" encoding="utf-8"?>
-<w:endnotes xmlns:wpc="http://schemas.microsoft.com/office/word/2010/wordprocessingCanvas" xmlns:cx="http://schemas.microsoft.com/office/drawing/2014/chartex" xmlns:cx1="http://schemas.microsoft.com/office/drawing/2015/9/8/chartex" xmlns:cx2="http://schemas.microsoft.com/office/drawing/2015/10/21/chartex" xmlns:cx3="http://schemas.microsoft.com/office/drawing/2016/5/9/chartex" xmlns:cx4="http://schemas.microsoft.com/office/drawing/2016/5/10/chartex" xmlns:cx5="http://schemas.microsoft.com/office/drawing/2016/5/11/chartex" xmlns:cx6="http://schemas.microsoft.com/office/drawing/2016/5/12/chartex" xmlns:cx7="http://schemas.microsoft.com/office/drawing/2016/5/13/chartex" xmlns:cx8="http://schemas.microsoft.com/office/drawing/2016/5/14/chartex" xmlns:mc="http://schemas.openxmlformats.org/markup-compatibility/2006" xmlns:aink="http://schemas.microsoft.com/office/drawing/2016/ink" xmlns:am3d="http://schemas.microsoft.com/office/drawing/2017/model3d" xmlns:o="urn:schemas-microsoft-com:office:office" xmlns:oel="http://schemas.microsoft.com/office/2019/extlst" xmlns:r="http://schemas.openxmlformats.org/officeDocument/2006/relationships" xmlns:m="http://schemas.openxmlformats.org/officeDocument/2006/math" xmlns:v="urn:schemas-microsoft-com:vml" xmlns:wp14="http://schemas.microsoft.com/office/word/2010/wordprocessingDrawing" xmlns:wp="http://schemas.openxmlformats.org/drawingml/2006/wordprocessingDrawing" xmlns:w10="urn:schemas-microsoft-com:office:word" xmlns:w="http://schemas.openxmlformats.org/wordprocessingml/2006/main" xmlns:w14="http://schemas.microsoft.com/office/word/2010/wordml" xmlns:w15="http://schemas.microsoft.com/office/word/2012/wordml" xmlns:w16cex="http://schemas.microsoft.com/office/word/2018/wordml/cex" xmlns:w16cid="http://schemas.microsoft.com/office/word/2016/wordml/cid" xmlns:w16="http://schemas.microsoft.com/office/word/2018/wordml" xmlns:w16du="http://schemas.microsoft.com/office/word/2023/wordml/word16du" xmlns:w16sdtdh="http://schemas.microsoft.com/office/word/2020/wordml/sdtdatahash" xmlns:w16sdtfl="http://schemas.microsoft.com/office/word/2024/wordml/sdtformatlock" xmlns:w16se="http://schemas.microsoft.com/office/word/2015/wordml/symex" xmlns:wpg="http://schemas.microsoft.com/office/word/2010/wordprocessingGroup" xmlns:wpi="http://schemas.microsoft.com/office/word/2010/wordprocessingInk" xmlns:wne="http://schemas.microsoft.com/office/word/2006/wordml" xmlns:wps="http://schemas.microsoft.com/office/word/2010/wordprocessingShape" mc:Ignorable="w14 w15 w16se w16cid w16 w16cex w16sdtdh w16sdtfl w16du wp14">
+<w:endnotes xmlns:wpc="http://schemas.microsoft.com/office/word/2010/wordprocessingCanvas" xmlns:cx="http://schemas.microsoft.com/office/drawing/2014/chartex" xmlns:cx1="http://schemas.microsoft.com/office/drawing/2015/9/8/chartex" xmlns:cx2="http://schemas.microsoft.com/office/drawing/2015/10/21/chartex" xmlns:cx3="http://schemas.microsoft.com/office/drawing/2016/5/9/chartex" xmlns:cx4="http://schemas.microsoft.com/office/drawing/2016/5/10/chartex" xmlns:cx5="http://schemas.microsoft.com/office/drawing/2016/5/11/chartex" xmlns:cx6="http://schemas.microsoft.com/office/drawing/2016/5/12/chartex" xmlns:cx7="http://schemas.microsoft.com/office/drawing/2016/5/13/chartex" xmlns:cx8="http://schemas.microsoft.com/office/drawing/2016/5/14/chartex" xmlns:mc="http://schemas.openxmlformats.org/markup-compatibility/2006" xmlns:m="http://schemas.openxmlformats.org/officeDocument/2006/math" xmlns:aink="http://schemas.microsoft.com/office/drawing/2016/ink" xmlns:am3d="http://schemas.microsoft.com/office/drawing/2017/model3d" xmlns:oel="http://schemas.microsoft.com/office/2019/extlst" xmlns:r="http://schemas.openxmlformats.org/officeDocument/2006/relationships" xmlns:wp14="http://schemas.microsoft.com/office/word/2010/wordprocessingDrawing" xmlns:wp="http://schemas.openxmlformats.org/drawingml/2006/wordprocessingDrawing" xmlns:wpg="http://schemas.microsoft.com/office/word/2010/wordprocessingGroup" xmlns:wpi="http://schemas.microsoft.com/office/word/2010/wordprocessingInk" xmlns:wps="http://schemas.microsoft.com/office/word/2010/wordprocessingShape" xmlns:o="urn:schemas-microsoft-com:office:office" xmlns:v="urn:schemas-microsoft-com:vml" xmlns:w10="urn:schemas-microsoft-com:office:word" xmlns:w="http://schemas.openxmlformats.org/wordprocessingml/2006/main" xmlns:w14="http://schemas.microsoft.com/office/word/2010/wordml" xmlns:w15="http://schemas.microsoft.com/office/word/2012/wordml" xmlns:w16cex="http://schemas.microsoft.com/office/word/2018/wordml/cex" xmlns:w16cid="http://schemas.microsoft.com/office/word/2016/wordml/cid" xmlns:w16="http://schemas.microsoft.com/office/word/2018/wordml" xmlns:w16sdtdh="http://schemas.microsoft.com/office/word/2020/wordml/sdtdatahash" xmlns:w16sdtfl="http://schemas.microsoft.com/office/word/2024/wordml/sdtformatlock" xmlns:w16se="http://schemas.microsoft.com/office/word/2015/wordml/symex" xmlns:w16du="http://schemas.microsoft.com/office/word/2023/wordml/word16du" xmlns:wne="http://schemas.microsoft.com/office/word/2006/wordml" mc:Ignorable="w14 w15 w16se w16cid w16 w16cex w16sdtdh w16sdtfl w16du wp14">
   <w:endnote w:type="separator" w:id="-1">
     <w:p>
       <w:pPr>
@@ -384,7 +431,7 @@
 </file>
 
 <file path=word/footnotes.xml><?xml version="1.0" encoding="utf-8"?>
-<w:footnotes xmlns:wpc="http://schemas.microsoft.com/office/word/2010/wordprocessingCanvas" xmlns:cx="http://schemas.microsoft.com/office/drawing/2014/chartex" xmlns:cx1="http://schemas.microsoft.com/office/drawing/2015/9/8/chartex" xmlns:cx2="http://schemas.microsoft.com/office/drawing/2015/10/21/chartex" xmlns:cx3="http://schemas.microsoft.com/office/drawing/2016/5/9/chartex" xmlns:cx4="http://schemas.microsoft.com/office/drawing/2016/5/10/chartex" xmlns:cx5="http://schemas.microsoft.com/office/drawing/2016/5/11/chartex" xmlns:cx6="http://schemas.microsoft.com/office/drawing/2016/5/12/chartex" xmlns:cx7="http://schemas.microsoft.com/office/drawing/2016/5/13/chartex" xmlns:cx8="http://schemas.microsoft.com/office/drawing/2016/5/14/chartex" xmlns:mc="http://schemas.openxmlformats.org/markup-compatibility/2006" xmlns:aink="http://schemas.microsoft.com/office/drawing/2016/ink" xmlns:am3d="http://schemas.microsoft.com/office/drawing/2017/model3d" xmlns:o="urn:schemas-microsoft-com:office:office" xmlns:oel="http://schemas.microsoft.com/office/2019/extlst" xmlns:r="http://schemas.openxmlformats.org/officeDocument/2006/relationships" xmlns:m="http://schemas.openxmlformats.org/officeDocument/2006/math" xmlns:v="urn:schemas-microsoft-com:vml" xmlns:wp14="http://schemas.microsoft.com/office/word/2010/wordprocessingDrawing" xmlns:wp="http://schemas.openxmlformats.org/drawingml/2006/wordprocessingDrawing" xmlns:w10="urn:schemas-microsoft-com:office:word" xmlns:w="http://schemas.openxmlformats.org/wordprocessingml/2006/main" xmlns:w14="http://schemas.microsoft.com/office/word/2010/wordml" xmlns:w15="http://schemas.microsoft.com/office/word/2012/wordml" xmlns:w16cex="http://schemas.microsoft.com/office/word/2018/wordml/cex" xmlns:w16cid="http://schemas.microsoft.com/office/word/2016/wordml/cid" xmlns:w16="http://schemas.microsoft.com/office/word/2018/wordml" xmlns:w16du="http://schemas.microsoft.com/office/word/2023/wordml/word16du" xmlns:w16sdtdh="http://schemas.microsoft.com/office/word/2020/wordml/sdtdatahash" xmlns:w16sdtfl="http://schemas.microsoft.com/office/word/2024/wordml/sdtformatlock" xmlns:w16se="http://schemas.microsoft.com/office/word/2015/wordml/symex" xmlns:wpg="http://schemas.microsoft.com/office/word/2010/wordprocessingGroup" xmlns:wpi="http://schemas.microsoft.com/office/word/2010/wordprocessingInk" xmlns:wne="http://schemas.microsoft.com/office/word/2006/wordml" xmlns:wps="http://schemas.microsoft.com/office/word/2010/wordprocessingShape" mc:Ignorable="w14 w15 w16se w16cid w16 w16cex w16sdtdh w16sdtfl w16du wp14">
+<w:footnotes xmlns:wpc="http://schemas.microsoft.com/office/word/2010/wordprocessingCanvas" xmlns:cx="http://schemas.microsoft.com/office/drawing/2014/chartex" xmlns:cx1="http://schemas.microsoft.com/office/drawing/2015/9/8/chartex" xmlns:cx2="http://schemas.microsoft.com/office/drawing/2015/10/21/chartex" xmlns:cx3="http://schemas.microsoft.com/office/drawing/2016/5/9/chartex" xmlns:cx4="http://schemas.microsoft.com/office/drawing/2016/5/10/chartex" xmlns:cx5="http://schemas.microsoft.com/office/drawing/2016/5/11/chartex" xmlns:cx6="http://schemas.microsoft.com/office/drawing/2016/5/12/chartex" xmlns:cx7="http://schemas.microsoft.com/office/drawing/2016/5/13/chartex" xmlns:cx8="http://schemas.microsoft.com/office/drawing/2016/5/14/chartex" xmlns:mc="http://schemas.openxmlformats.org/markup-compatibility/2006" xmlns:m="http://schemas.openxmlformats.org/officeDocument/2006/math" xmlns:aink="http://schemas.microsoft.com/office/drawing/2016/ink" xmlns:am3d="http://schemas.microsoft.com/office/drawing/2017/model3d" xmlns:oel="http://schemas.microsoft.com/office/2019/extlst" xmlns:r="http://schemas.openxmlformats.org/officeDocument/2006/relationships" xmlns:wp14="http://schemas.microsoft.com/office/word/2010/wordprocessingDrawing" xmlns:wp="http://schemas.openxmlformats.org/drawingml/2006/wordprocessingDrawing" xmlns:wpg="http://schemas.microsoft.com/office/word/2010/wordprocessingGroup" xmlns:wpi="http://schemas.microsoft.com/office/word/2010/wordprocessingInk" xmlns:wps="http://schemas.microsoft.com/office/word/2010/wordprocessingShape" xmlns:o="urn:schemas-microsoft-com:office:office" xmlns:v="urn:schemas-microsoft-com:vml" xmlns:w10="urn:schemas-microsoft-com:office:word" xmlns:w="http://schemas.openxmlformats.org/wordprocessingml/2006/main" xmlns:w14="http://schemas.microsoft.com/office/word/2010/wordml" xmlns:w15="http://schemas.microsoft.com/office/word/2012/wordml" xmlns:w16cex="http://schemas.microsoft.com/office/word/2018/wordml/cex" xmlns:w16cid="http://schemas.microsoft.com/office/word/2016/wordml/cid" xmlns:w16="http://schemas.microsoft.com/office/word/2018/wordml" xmlns:w16sdtdh="http://schemas.microsoft.com/office/word/2020/wordml/sdtdatahash" xmlns:w16sdtfl="http://schemas.microsoft.com/office/word/2024/wordml/sdtformatlock" xmlns:w16se="http://schemas.microsoft.com/office/word/2015/wordml/symex" xmlns:w16du="http://schemas.microsoft.com/office/word/2023/wordml/word16du" xmlns:wne="http://schemas.microsoft.com/office/word/2006/wordml" mc:Ignorable="w14 w15 w16se w16cid w16 w16cex w16sdtdh w16sdtfl w16du wp14">
   <w:footnote w:type="separator" w:id="-1">
     <w:p>
       <w:pPr>
@@ -409,7 +456,7 @@
 </file>
 
 <file path=word/header1.xml><?xml version="1.0" encoding="utf-8"?>
-<w:hdr xmlns:wpc="http://schemas.microsoft.com/office/word/2010/wordprocessingCanvas" xmlns:cx="http://schemas.microsoft.com/office/drawing/2014/chartex" xmlns:cx1="http://schemas.microsoft.com/office/drawing/2015/9/8/chartex" xmlns:cx2="http://schemas.microsoft.com/office/drawing/2015/10/21/chartex" xmlns:cx3="http://schemas.microsoft.com/office/drawing/2016/5/9/chartex" xmlns:cx4="http://schemas.microsoft.com/office/drawing/2016/5/10/chartex" xmlns:cx5="http://schemas.microsoft.com/office/drawing/2016/5/11/chartex" xmlns:cx6="http://schemas.microsoft.com/office/drawing/2016/5/12/chartex" xmlns:cx7="http://schemas.microsoft.com/office/drawing/2016/5/13/chartex" xmlns:cx8="http://schemas.microsoft.com/office/drawing/2016/5/14/chartex" xmlns:mc="http://schemas.openxmlformats.org/markup-compatibility/2006" xmlns:aink="http://schemas.microsoft.com/office/drawing/2016/ink" xmlns:am3d="http://schemas.microsoft.com/office/drawing/2017/model3d" xmlns:o="urn:schemas-microsoft-com:office:office" xmlns:oel="http://schemas.microsoft.com/office/2019/extlst" xmlns:r="http://schemas.openxmlformats.org/officeDocument/2006/relationships" xmlns:m="http://schemas.openxmlformats.org/officeDocument/2006/math" xmlns:v="urn:schemas-microsoft-com:vml" xmlns:wp14="http://schemas.microsoft.com/office/word/2010/wordprocessingDrawing" xmlns:wp="http://schemas.openxmlformats.org/drawingml/2006/wordprocessingDrawing" xmlns:w10="urn:schemas-microsoft-com:office:word" xmlns:w="http://schemas.openxmlformats.org/wordprocessingml/2006/main" xmlns:w14="http://schemas.microsoft.com/office/word/2010/wordml" xmlns:w15="http://schemas.microsoft.com/office/word/2012/wordml" xmlns:w16cex="http://schemas.microsoft.com/office/word/2018/wordml/cex" xmlns:w16cid="http://schemas.microsoft.com/office/word/2016/wordml/cid" xmlns:w16="http://schemas.microsoft.com/office/word/2018/wordml" xmlns:w16du="http://schemas.microsoft.com/office/word/2023/wordml/word16du" xmlns:w16sdtdh="http://schemas.microsoft.com/office/word/2020/wordml/sdtdatahash" xmlns:w16sdtfl="http://schemas.microsoft.com/office/word/2024/wordml/sdtformatlock" xmlns:w16se="http://schemas.microsoft.com/office/word/2015/wordml/symex" xmlns:wpg="http://schemas.microsoft.com/office/word/2010/wordprocessingGroup" xmlns:wpi="http://schemas.microsoft.com/office/word/2010/wordprocessingInk" xmlns:wne="http://schemas.microsoft.com/office/word/2006/wordml" xmlns:wps="http://schemas.microsoft.com/office/word/2010/wordprocessingShape" mc:Ignorable="w14 w15 w16se w16cid w16 w16cex w16sdtdh w16sdtfl w16du wp14">
+<w:hdr xmlns:wpc="http://schemas.microsoft.com/office/word/2010/wordprocessingCanvas" xmlns:cx="http://schemas.microsoft.com/office/drawing/2014/chartex" xmlns:cx1="http://schemas.microsoft.com/office/drawing/2015/9/8/chartex" xmlns:cx2="http://schemas.microsoft.com/office/drawing/2015/10/21/chartex" xmlns:cx3="http://schemas.microsoft.com/office/drawing/2016/5/9/chartex" xmlns:cx4="http://schemas.microsoft.com/office/drawing/2016/5/10/chartex" xmlns:cx5="http://schemas.microsoft.com/office/drawing/2016/5/11/chartex" xmlns:cx6="http://schemas.microsoft.com/office/drawing/2016/5/12/chartex" xmlns:cx7="http://schemas.microsoft.com/office/drawing/2016/5/13/chartex" xmlns:cx8="http://schemas.microsoft.com/office/drawing/2016/5/14/chartex" xmlns:mc="http://schemas.openxmlformats.org/markup-compatibility/2006" xmlns:m="http://schemas.openxmlformats.org/officeDocument/2006/math" xmlns:aink="http://schemas.microsoft.com/office/drawing/2016/ink" xmlns:am3d="http://schemas.microsoft.com/office/drawing/2017/model3d" xmlns:oel="http://schemas.microsoft.com/office/2019/extlst" xmlns:r="http://schemas.openxmlformats.org/officeDocument/2006/relationships" xmlns:wp14="http://schemas.microsoft.com/office/word/2010/wordprocessingDrawing" xmlns:wp="http://schemas.openxmlformats.org/drawingml/2006/wordprocessingDrawing" xmlns:wpg="http://schemas.microsoft.com/office/word/2010/wordprocessingGroup" xmlns:wpi="http://schemas.microsoft.com/office/word/2010/wordprocessingInk" xmlns:wps="http://schemas.microsoft.com/office/word/2010/wordprocessingShape" xmlns:o="urn:schemas-microsoft-com:office:office" xmlns:v="urn:schemas-microsoft-com:vml" xmlns:w10="urn:schemas-microsoft-com:office:word" xmlns:w="http://schemas.openxmlformats.org/wordprocessingml/2006/main" xmlns:w14="http://schemas.microsoft.com/office/word/2010/wordml" xmlns:w15="http://schemas.microsoft.com/office/word/2012/wordml" xmlns:w16cex="http://schemas.microsoft.com/office/word/2018/wordml/cex" xmlns:w16cid="http://schemas.microsoft.com/office/word/2016/wordml/cid" xmlns:w16="http://schemas.microsoft.com/office/word/2018/wordml" xmlns:w16sdtdh="http://schemas.microsoft.com/office/word/2020/wordml/sdtdatahash" xmlns:w16sdtfl="http://schemas.microsoft.com/office/word/2024/wordml/sdtformatlock" xmlns:w16se="http://schemas.microsoft.com/office/word/2015/wordml/symex" xmlns:w16du="http://schemas.microsoft.com/office/word/2023/wordml/word16du" xmlns:wne="http://schemas.microsoft.com/office/word/2006/wordml" mc:Ignorable="w14 w15 w16se w16cid w16 w16cex w16sdtdh w16sdtfl w16du wp14">
   <w:p>
     <w:pPr>
       <w:pStyle w:val="Header"/>
@@ -581,7 +628,7 @@
 </file>
 
 <file path=word/header2.xml><?xml version="1.0" encoding="utf-8"?>
-<w:hdr xmlns:wpc="http://schemas.microsoft.com/office/word/2010/wordprocessingCanvas" xmlns:cx="http://schemas.microsoft.com/office/drawing/2014/chartex" xmlns:cx1="http://schemas.microsoft.com/office/drawing/2015/9/8/chartex" xmlns:cx2="http://schemas.microsoft.com/office/drawing/2015/10/21/chartex" xmlns:cx3="http://schemas.microsoft.com/office/drawing/2016/5/9/chartex" xmlns:cx4="http://schemas.microsoft.com/office/drawing/2016/5/10/chartex" xmlns:cx5="http://schemas.microsoft.com/office/drawing/2016/5/11/chartex" xmlns:cx6="http://schemas.microsoft.com/office/drawing/2016/5/12/chartex" xmlns:cx7="http://schemas.microsoft.com/office/drawing/2016/5/13/chartex" xmlns:cx8="http://schemas.microsoft.com/office/drawing/2016/5/14/chartex" xmlns:mc="http://schemas.openxmlformats.org/markup-compatibility/2006" xmlns:aink="http://schemas.microsoft.com/office/drawing/2016/ink" xmlns:am3d="http://schemas.microsoft.com/office/drawing/2017/model3d" xmlns:o="urn:schemas-microsoft-com:office:office" xmlns:oel="http://schemas.microsoft.com/office/2019/extlst" xmlns:r="http://schemas.openxmlformats.org/officeDocument/2006/relationships" xmlns:m="http://schemas.openxmlformats.org/officeDocument/2006/math" xmlns:v="urn:schemas-microsoft-com:vml" xmlns:wp14="http://schemas.microsoft.com/office/word/2010/wordprocessingDrawing" xmlns:wp="http://schemas.openxmlformats.org/drawingml/2006/wordprocessingDrawing" xmlns:w10="urn:schemas-microsoft-com:office:word" xmlns:w="http://schemas.openxmlformats.org/wordprocessingml/2006/main" xmlns:w14="http://schemas.microsoft.com/office/word/2010/wordml" xmlns:w15="http://schemas.microsoft.com/office/word/2012/wordml" xmlns:w16cex="http://schemas.microsoft.com/office/word/2018/wordml/cex" xmlns:w16cid="http://schemas.microsoft.com/office/word/2016/wordml/cid" xmlns:w16="http://schemas.microsoft.com/office/word/2018/wordml" xmlns:w16du="http://schemas.microsoft.com/office/word/2023/wordml/word16du" xmlns:w16sdtdh="http://schemas.microsoft.com/office/word/2020/wordml/sdtdatahash" xmlns:w16sdtfl="http://schemas.microsoft.com/office/word/2024/wordml/sdtformatlock" xmlns:w16se="http://schemas.microsoft.com/office/word/2015/wordml/symex" xmlns:wpg="http://schemas.microsoft.com/office/word/2010/wordprocessingGroup" xmlns:wpi="http://schemas.microsoft.com/office/word/2010/wordprocessingInk" xmlns:wne="http://schemas.microsoft.com/office/word/2006/wordml" xmlns:wps="http://schemas.microsoft.com/office/word/2010/wordprocessingShape" mc:Ignorable="w14 w15 w16se w16cid w16 w16cex w16sdtdh w16sdtfl w16du wp14">
+<w:hdr xmlns:wpc="http://schemas.microsoft.com/office/word/2010/wordprocessingCanvas" xmlns:cx="http://schemas.microsoft.com/office/drawing/2014/chartex" xmlns:cx1="http://schemas.microsoft.com/office/drawing/2015/9/8/chartex" xmlns:cx2="http://schemas.microsoft.com/office/drawing/2015/10/21/chartex" xmlns:cx3="http://schemas.microsoft.com/office/drawing/2016/5/9/chartex" xmlns:cx4="http://schemas.microsoft.com/office/drawing/2016/5/10/chartex" xmlns:cx5="http://schemas.microsoft.com/office/drawing/2016/5/11/chartex" xmlns:cx6="http://schemas.microsoft.com/office/drawing/2016/5/12/chartex" xmlns:cx7="http://schemas.microsoft.com/office/drawing/2016/5/13/chartex" xmlns:cx8="http://schemas.microsoft.com/office/drawing/2016/5/14/chartex" xmlns:mc="http://schemas.openxmlformats.org/markup-compatibility/2006" xmlns:m="http://schemas.openxmlformats.org/officeDocument/2006/math" xmlns:aink="http://schemas.microsoft.com/office/drawing/2016/ink" xmlns:am3d="http://schemas.microsoft.com/office/drawing/2017/model3d" xmlns:oel="http://schemas.microsoft.com/office/2019/extlst" xmlns:r="http://schemas.openxmlformats.org/officeDocument/2006/relationships" xmlns:wp14="http://schemas.microsoft.com/office/word/2010/wordprocessingDrawing" xmlns:wp="http://schemas.openxmlformats.org/drawingml/2006/wordprocessingDrawing" xmlns:wpg="http://schemas.microsoft.com/office/word/2010/wordprocessingGroup" xmlns:wpi="http://schemas.microsoft.com/office/word/2010/wordprocessingInk" xmlns:wps="http://schemas.microsoft.com/office/word/2010/wordprocessingShape" xmlns:o="urn:schemas-microsoft-com:office:office" xmlns:v="urn:schemas-microsoft-com:vml" xmlns:w10="urn:schemas-microsoft-com:office:word" xmlns:w="http://schemas.openxmlformats.org/wordprocessingml/2006/main" xmlns:w14="http://schemas.microsoft.com/office/word/2010/wordml" xmlns:w15="http://schemas.microsoft.com/office/word/2012/wordml" xmlns:w16cex="http://schemas.microsoft.com/office/word/2018/wordml/cex" xmlns:w16cid="http://schemas.microsoft.com/office/word/2016/wordml/cid" xmlns:w16="http://schemas.microsoft.com/office/word/2018/wordml" xmlns:w16sdtdh="http://schemas.microsoft.com/office/word/2020/wordml/sdtdatahash" xmlns:w16sdtfl="http://schemas.microsoft.com/office/word/2024/wordml/sdtformatlock" xmlns:w16se="http://schemas.microsoft.com/office/word/2015/wordml/symex" xmlns:w16du="http://schemas.microsoft.com/office/word/2023/wordml/word16du" xmlns:wne="http://schemas.microsoft.com/office/word/2006/wordml" mc:Ignorable="w14 w15 w16se w16cid w16 w16cex w16sdtdh w16sdtfl w16du wp14">
   <w:p>
     <w:pPr>
       <w:pStyle w:val="Header"/>
@@ -753,7 +800,7 @@
 </file>
 
 <file path=word/header3.xml><?xml version="1.0" encoding="utf-8"?>
-<w:hdr xmlns:wpc="http://schemas.microsoft.com/office/word/2010/wordprocessingCanvas" xmlns:cx="http://schemas.microsoft.com/office/drawing/2014/chartex" xmlns:cx1="http://schemas.microsoft.com/office/drawing/2015/9/8/chartex" xmlns:cx2="http://schemas.microsoft.com/office/drawing/2015/10/21/chartex" xmlns:cx3="http://schemas.microsoft.com/office/drawing/2016/5/9/chartex" xmlns:cx4="http://schemas.microsoft.com/office/drawing/2016/5/10/chartex" xmlns:cx5="http://schemas.microsoft.com/office/drawing/2016/5/11/chartex" xmlns:cx6="http://schemas.microsoft.com/office/drawing/2016/5/12/chartex" xmlns:cx7="http://schemas.microsoft.com/office/drawing/2016/5/13/chartex" xmlns:cx8="http://schemas.microsoft.com/office/drawing/2016/5/14/chartex" xmlns:mc="http://schemas.openxmlformats.org/markup-compatibility/2006" xmlns:aink="http://schemas.microsoft.com/office/drawing/2016/ink" xmlns:am3d="http://schemas.microsoft.com/office/drawing/2017/model3d" xmlns:o="urn:schemas-microsoft-com:office:office" xmlns:oel="http://schemas.microsoft.com/office/2019/extlst" xmlns:r="http://schemas.openxmlformats.org/officeDocument/2006/relationships" xmlns:m="http://schemas.openxmlformats.org/officeDocument/2006/math" xmlns:v="urn:schemas-microsoft-com:vml" xmlns:wp14="http://schemas.microsoft.com/office/word/2010/wordprocessingDrawing" xmlns:wp="http://schemas.openxmlformats.org/drawingml/2006/wordprocessingDrawing" xmlns:w10="urn:schemas-microsoft-com:office:word" xmlns:w="http://schemas.openxmlformats.org/wordprocessingml/2006/main" xmlns:w14="http://schemas.microsoft.com/office/word/2010/wordml" xmlns:w15="http://schemas.microsoft.com/office/word/2012/wordml" xmlns:w16cex="http://schemas.microsoft.com/office/word/2018/wordml/cex" xmlns:w16cid="http://schemas.microsoft.com/office/word/2016/wordml/cid" xmlns:w16="http://schemas.microsoft.com/office/word/2018/wordml" xmlns:w16du="http://schemas.microsoft.com/office/word/2023/wordml/word16du" xmlns:w16sdtdh="http://schemas.microsoft.com/office/word/2020/wordml/sdtdatahash" xmlns:w16sdtfl="http://schemas.microsoft.com/office/word/2024/wordml/sdtformatlock" xmlns:w16se="http://schemas.microsoft.com/office/word/2015/wordml/symex" xmlns:wpg="http://schemas.microsoft.com/office/word/2010/wordprocessingGroup" xmlns:wpi="http://schemas.microsoft.com/office/word/2010/wordprocessingInk" xmlns:wne="http://schemas.microsoft.com/office/word/2006/wordml" xmlns:wps="http://schemas.microsoft.com/office/word/2010/wordprocessingShape" mc:Ignorable="w14 w15 w16se w16cid w16 w16cex w16sdtdh w16sdtfl w16du wp14">
+<w:hdr xmlns:wpc="http://schemas.microsoft.com/office/word/2010/wordprocessingCanvas" xmlns:cx="http://schemas.microsoft.com/office/drawing/2014/chartex" xmlns:cx1="http://schemas.microsoft.com/office/drawing/2015/9/8/chartex" xmlns:cx2="http://schemas.microsoft.com/office/drawing/2015/10/21/chartex" xmlns:cx3="http://schemas.microsoft.com/office/drawing/2016/5/9/chartex" xmlns:cx4="http://schemas.microsoft.com/office/drawing/2016/5/10/chartex" xmlns:cx5="http://schemas.microsoft.com/office/drawing/2016/5/11/chartex" xmlns:cx6="http://schemas.microsoft.com/office/drawing/2016/5/12/chartex" xmlns:cx7="http://schemas.microsoft.com/office/drawing/2016/5/13/chartex" xmlns:cx8="http://schemas.microsoft.com/office/drawing/2016/5/14/chartex" xmlns:mc="http://schemas.openxmlformats.org/markup-compatibility/2006" xmlns:m="http://schemas.openxmlformats.org/officeDocument/2006/math" xmlns:aink="http://schemas.microsoft.com/office/drawing/2016/ink" xmlns:am3d="http://schemas.microsoft.com/office/drawing/2017/model3d" xmlns:oel="http://schemas.microsoft.com/office/2019/extlst" xmlns:r="http://schemas.openxmlformats.org/officeDocument/2006/relationships" xmlns:wp14="http://schemas.microsoft.com/office/word/2010/wordprocessingDrawing" xmlns:wp="http://schemas.openxmlformats.org/drawingml/2006/wordprocessingDrawing" xmlns:wpg="http://schemas.microsoft.com/office/word/2010/wordprocessingGroup" xmlns:wpi="http://schemas.microsoft.com/office/word/2010/wordprocessingInk" xmlns:wps="http://schemas.microsoft.com/office/word/2010/wordprocessingShape" xmlns:o="urn:schemas-microsoft-com:office:office" xmlns:v="urn:schemas-microsoft-com:vml" xmlns:w10="urn:schemas-microsoft-com:office:word" xmlns:w="http://schemas.openxmlformats.org/wordprocessingml/2006/main" xmlns:w14="http://schemas.microsoft.com/office/word/2010/wordml" xmlns:w15="http://schemas.microsoft.com/office/word/2012/wordml" xmlns:w16cex="http://schemas.microsoft.com/office/word/2018/wordml/cex" xmlns:w16cid="http://schemas.microsoft.com/office/word/2016/wordml/cid" xmlns:w16="http://schemas.microsoft.com/office/word/2018/wordml" xmlns:w16sdtdh="http://schemas.microsoft.com/office/word/2020/wordml/sdtdatahash" xmlns:w16sdtfl="http://schemas.microsoft.com/office/word/2024/wordml/sdtformatlock" xmlns:w16se="http://schemas.microsoft.com/office/word/2015/wordml/symex" xmlns:w16du="http://schemas.microsoft.com/office/word/2023/wordml/word16du" xmlns:wne="http://schemas.microsoft.com/office/word/2006/wordml" mc:Ignorable="w14 w15 w16se w16cid w16 w16cex w16sdtdh w16sdtfl w16du wp14">
   <w:p>
     <w:pPr>
       <w:pStyle w:val="Header"/>
@@ -925,7 +972,7 @@
 </file>
 
 <file path=word/styles.xml><?xml version="1.0" encoding="utf-8"?>
-<w:styles xmlns:mc="http://schemas.openxmlformats.org/markup-compatibility/2006" xmlns:r="http://schemas.openxmlformats.org/officeDocument/2006/relationships" xmlns:w="http://schemas.openxmlformats.org/wordprocessingml/2006/main" xmlns:w14="http://schemas.microsoft.com/office/word/2010/wordml" xmlns:w15="http://schemas.microsoft.com/office/word/2012/wordml" xmlns:w16cex="http://schemas.microsoft.com/office/word/2018/wordml/cex" xmlns:w16cid="http://schemas.microsoft.com/office/word/2016/wordml/cid" xmlns:w16="http://schemas.microsoft.com/office/word/2018/wordml" xmlns:w16du="http://schemas.microsoft.com/office/word/2023/wordml/word16du" xmlns:w16sdtdh="http://schemas.microsoft.com/office/word/2020/wordml/sdtdatahash" xmlns:w16sdtfl="http://schemas.microsoft.com/office/word/2024/wordml/sdtformatlock" xmlns:w16se="http://schemas.microsoft.com/office/word/2015/wordml/symex" mc:Ignorable="w14 w15 w16se w16cid w16 w16cex w16sdtdh w16sdtfl w16du">
+<w:styles xmlns:mc="http://schemas.openxmlformats.org/markup-compatibility/2006" xmlns:r="http://schemas.openxmlformats.org/officeDocument/2006/relationships" xmlns:w="http://schemas.openxmlformats.org/wordprocessingml/2006/main" xmlns:w14="http://schemas.microsoft.com/office/word/2010/wordml" xmlns:w15="http://schemas.microsoft.com/office/word/2012/wordml" xmlns:w16cex="http://schemas.microsoft.com/office/word/2018/wordml/cex" xmlns:w16cid="http://schemas.microsoft.com/office/word/2016/wordml/cid" xmlns:w16="http://schemas.microsoft.com/office/word/2018/wordml" xmlns:w16sdtdh="http://schemas.microsoft.com/office/word/2020/wordml/sdtdatahash" xmlns:w16sdtfl="http://schemas.microsoft.com/office/word/2024/wordml/sdtformatlock" xmlns:w16se="http://schemas.microsoft.com/office/word/2015/wordml/symex" xmlns:w16du="http://schemas.microsoft.com/office/word/2023/wordml/word16du" mc:Ignorable="w14 w15 w16se w16cid w16 w16cex w16sdtdh w16sdtfl w16du">
   <w:docDefaults>
     <w:rPrDefault>
       <w:rPr>

</xml_diff>